<commit_message>
Páginas: Equipo. Contacto, Index y Cursos
He realizado cambios para mejorar cada una de las páginas como son: incluir las redes sociales, incluir los miembros del equipo, la lista de cursos que impartiremos...
</commit_message>
<xml_diff>
--- a/Documentación del proyecto/Trazabilidad/Trazabilidad diaria - Febrero.docx
+++ b/Documentación del proyecto/Trazabilidad/Trazabilidad diaria - Febrero.docx
@@ -1,6 +1,6 @@
 
 <file path=word/document.xml><?xml version="1.0" encoding="utf-8"?>
-<w:document xmlns:wpc="http://schemas.microsoft.com/office/word/2010/wordprocessingCanvas" xmlns:cx="http://schemas.microsoft.com/office/drawing/2014/chartex" xmlns:cx1="http://schemas.microsoft.com/office/drawing/2015/9/8/chartex" xmlns:cx2="http://schemas.microsoft.com/office/drawing/2015/10/21/chartex" xmlns:cx3="http://schemas.microsoft.com/office/drawing/2016/5/9/chartex" xmlns:cx4="http://schemas.microsoft.com/office/drawing/2016/5/10/chartex" xmlns:cx5="http://schemas.microsoft.com/office/drawing/2016/5/11/chartex" xmlns:cx6="http://schemas.microsoft.com/office/drawing/2016/5/12/chartex" xmlns:cx7="http://schemas.microsoft.com/office/drawing/2016/5/13/chartex" xmlns:cx8="http://schemas.microsoft.com/office/drawing/2016/5/14/chartex" xmlns:mc="http://schemas.openxmlformats.org/markup-compatibility/2006" xmlns:aink="http://schemas.microsoft.com/office/drawing/2016/ink" xmlns:am3d="http://schemas.microsoft.com/office/drawing/2017/model3d" xmlns:o="urn:schemas-microsoft-com:office:office" xmlns:oel="http://schemas.microsoft.com/office/2019/extlst" xmlns:r="http://schemas.openxmlformats.org/officeDocument/2006/relationships" xmlns:m="http://schemas.openxmlformats.org/officeDocument/2006/math" xmlns:v="urn:schemas-microsoft-com:vml" xmlns:wp14="http://schemas.microsoft.com/office/word/2010/wordprocessingDrawing" xmlns:wp="http://schemas.openxmlformats.org/drawingml/2006/wordprocessingDrawing" xmlns:w10="urn:schemas-microsoft-com:office:word" xmlns:w="http://schemas.openxmlformats.org/wordprocessingml/2006/main" xmlns:w14="http://schemas.microsoft.com/office/word/2010/wordml" xmlns:w15="http://schemas.microsoft.com/office/word/2012/wordml" xmlns:w16cex="http://schemas.microsoft.com/office/word/2018/wordml/cex" xmlns:w16cid="http://schemas.microsoft.com/office/word/2016/wordml/cid" xmlns:w16="http://schemas.microsoft.com/office/word/2018/wordml" xmlns:w16du="http://schemas.microsoft.com/office/word/2023/wordml/word16du" xmlns:w16sdtdh="http://schemas.microsoft.com/office/word/2020/wordml/sdtdatahash" xmlns:w16sdtfl="http://schemas.microsoft.com/office/word/2024/wordml/sdtformatlock" xmlns:w16se="http://schemas.microsoft.com/office/word/2015/wordml/symex" xmlns:wpg="http://schemas.microsoft.com/office/word/2010/wordprocessingGroup" xmlns:wpi="http://schemas.microsoft.com/office/word/2010/wordprocessingInk" xmlns:wne="http://schemas.microsoft.com/office/word/2006/wordml" xmlns:wps="http://schemas.microsoft.com/office/word/2010/wordprocessingShape" mc:Ignorable="w14 w15 w16se w16cid w16 w16cex w16sdtdh w16sdtfl w16du wp14">
+<w:document xmlns:wpc="http://schemas.microsoft.com/office/word/2010/wordprocessingCanvas" xmlns:cx="http://schemas.microsoft.com/office/drawing/2014/chartex" xmlns:cx1="http://schemas.microsoft.com/office/drawing/2015/9/8/chartex" xmlns:cx2="http://schemas.microsoft.com/office/drawing/2015/10/21/chartex" xmlns:cx3="http://schemas.microsoft.com/office/drawing/2016/5/9/chartex" xmlns:cx4="http://schemas.microsoft.com/office/drawing/2016/5/10/chartex" xmlns:cx5="http://schemas.microsoft.com/office/drawing/2016/5/11/chartex" xmlns:cx6="http://schemas.microsoft.com/office/drawing/2016/5/12/chartex" xmlns:cx7="http://schemas.microsoft.com/office/drawing/2016/5/13/chartex" xmlns:cx8="http://schemas.microsoft.com/office/drawing/2016/5/14/chartex" xmlns:mc="http://schemas.openxmlformats.org/markup-compatibility/2006" xmlns:aink="http://schemas.microsoft.com/office/drawing/2016/ink" xmlns:am3d="http://schemas.microsoft.com/office/drawing/2017/model3d" xmlns:o="urn:schemas-microsoft-com:office:office" xmlns:r="http://schemas.openxmlformats.org/officeDocument/2006/relationships" xmlns:m="http://schemas.openxmlformats.org/officeDocument/2006/math" xmlns:v="urn:schemas-microsoft-com:vml" xmlns:wp14="http://schemas.microsoft.com/office/word/2010/wordprocessingDrawing" xmlns:wp="http://schemas.openxmlformats.org/drawingml/2006/wordprocessingDrawing" xmlns:w10="urn:schemas-microsoft-com:office:word" xmlns:w="http://schemas.openxmlformats.org/wordprocessingml/2006/main" xmlns:w14="http://schemas.microsoft.com/office/word/2010/wordml" xmlns:w15="http://schemas.microsoft.com/office/word/2012/wordml" xmlns:w16cex="http://schemas.microsoft.com/office/word/2018/wordml/cex" xmlns:w16cid="http://schemas.microsoft.com/office/word/2016/wordml/cid" xmlns:w16="http://schemas.microsoft.com/office/word/2018/wordml" xmlns:w16sdtdh="http://schemas.microsoft.com/office/word/2020/wordml/sdtdatahash" xmlns:w16se="http://schemas.microsoft.com/office/word/2015/wordml/symex" xmlns:wpg="http://schemas.microsoft.com/office/word/2010/wordprocessingGroup" xmlns:wpi="http://schemas.microsoft.com/office/word/2010/wordprocessingInk" xmlns:wne="http://schemas.microsoft.com/office/word/2006/wordml" xmlns:wps="http://schemas.microsoft.com/office/word/2010/wordprocessingShape" mc:Ignorable="w14 w15 w16se w16cid w16 w16cex w16sdtdh wp14">
   <w:body>
     <w:p>
       <w:r>
@@ -16,7 +16,13 @@
         </w:numPr>
       </w:pPr>
       <w:r>
-        <w:t>13/02/2026</w:t>
+        <w:t>1</w:t>
+      </w:r>
+      <w:r>
+        <w:t>6</w:t>
+      </w:r>
+      <w:r>
+        <w:t>/02/2026</w:t>
       </w:r>
     </w:p>
     <w:p>
@@ -27,6 +33,301 @@
           <w:numId w:val="1"/>
         </w:numPr>
       </w:pPr>
+      <w:r>
+        <w:t>En el apartado de contacto, el botón de enviar lo he centrado realizando un: &lt;</w:t>
+      </w:r>
+      <w:proofErr w:type="spellStart"/>
+      <w:r>
+        <w:t>div</w:t>
+      </w:r>
+      <w:proofErr w:type="spellEnd"/>
+      <w:r>
+        <w:t xml:space="preserve"> </w:t>
+      </w:r>
+      <w:proofErr w:type="spellStart"/>
+      <w:r>
+        <w:t>style</w:t>
+      </w:r>
+      <w:proofErr w:type="spellEnd"/>
+      <w:r>
+        <w:t>=”</w:t>
+      </w:r>
+      <w:proofErr w:type="spellStart"/>
+      <w:r>
+        <w:t>text-align</w:t>
+      </w:r>
+      <w:proofErr w:type="spellEnd"/>
+      <w:r>
+        <w:t xml:space="preserve">: </w:t>
+      </w:r>
+      <w:proofErr w:type="gramStart"/>
+      <w:r>
+        <w:t xml:space="preserve">center;  </w:t>
+      </w:r>
+      <w:proofErr w:type="spellStart"/>
+      <w:r>
+        <w:t>width</w:t>
+      </w:r>
+      <w:proofErr w:type="spellEnd"/>
+      <w:proofErr w:type="gramEnd"/>
+      <w:r>
+        <w:t xml:space="preserve"> 100%; </w:t>
+      </w:r>
+      <w:proofErr w:type="spellStart"/>
+      <w:r>
+        <w:t>margin</w:t>
+      </w:r>
+      <w:proofErr w:type="spellEnd"/>
+      <w:r>
+        <w:t>-top 20px;” &gt;</w:t>
+      </w:r>
+    </w:p>
+    <w:p>
+      <w:pPr>
+        <w:pStyle w:val="Prrafodelista"/>
+        <w:numPr>
+          <w:ilvl w:val="1"/>
+          <w:numId w:val="1"/>
+        </w:numPr>
+      </w:pPr>
+      <w:r>
+        <w:t xml:space="preserve">El apartado de “acepto términos” estaba desplazado a la derecha y lo he arreglado en el CSS con las etiquetas: </w:t>
+      </w:r>
+      <w:proofErr w:type="spellStart"/>
+      <w:r>
+        <w:t>margin</w:t>
+      </w:r>
+      <w:proofErr w:type="spellEnd"/>
+      <w:r>
+        <w:t xml:space="preserve"> y gap.</w:t>
+      </w:r>
+    </w:p>
+    <w:p>
+      <w:pPr>
+        <w:pStyle w:val="Prrafodelista"/>
+        <w:numPr>
+          <w:ilvl w:val="1"/>
+          <w:numId w:val="1"/>
+        </w:numPr>
+      </w:pPr>
+      <w:r>
+        <w:t>En el apartado “index.html” he creado un botón de: Inscribirme ahora, he usado la siguiente etiqueta: &lt;</w:t>
+      </w:r>
+      <w:proofErr w:type="spellStart"/>
+      <w:r>
+        <w:t>div</w:t>
+      </w:r>
+      <w:proofErr w:type="spellEnd"/>
+      <w:r>
+        <w:t xml:space="preserve"> </w:t>
+      </w:r>
+      <w:proofErr w:type="spellStart"/>
+      <w:r>
+        <w:t>class</w:t>
+      </w:r>
+      <w:proofErr w:type="spellEnd"/>
+      <w:proofErr w:type="gramStart"/>
+      <w:r>
+        <w:t>=”suscribe</w:t>
+      </w:r>
+      <w:proofErr w:type="gramEnd"/>
+      <w:r>
+        <w:t xml:space="preserve">-container mt-4”&gt; &lt;a </w:t>
+      </w:r>
+      <w:proofErr w:type="spellStart"/>
+      <w:r>
+        <w:t>href</w:t>
+      </w:r>
+      <w:proofErr w:type="spellEnd"/>
+      <w:r>
+        <w:t xml:space="preserve">=”#” </w:t>
+      </w:r>
+      <w:proofErr w:type="spellStart"/>
+      <w:r>
+        <w:t>class</w:t>
+      </w:r>
+      <w:proofErr w:type="spellEnd"/>
+      <w:r>
+        <w:t>=”</w:t>
+      </w:r>
+      <w:proofErr w:type="spellStart"/>
+      <w:r>
+        <w:t>btn</w:t>
+      </w:r>
+      <w:proofErr w:type="spellEnd"/>
+      <w:r>
+        <w:t xml:space="preserve"> </w:t>
+      </w:r>
+      <w:proofErr w:type="spellStart"/>
+      <w:r>
+        <w:t>btn-primary</w:t>
+      </w:r>
+      <w:proofErr w:type="spellEnd"/>
+      <w:r>
+        <w:t xml:space="preserve"> </w:t>
+      </w:r>
+      <w:proofErr w:type="spellStart"/>
+      <w:r>
+        <w:t>suscribete-btn</w:t>
+      </w:r>
+      <w:proofErr w:type="spellEnd"/>
+      <w:r>
+        <w:t>”&gt;Inscribirme ahora&lt;/a&gt; &lt;/</w:t>
+      </w:r>
+      <w:proofErr w:type="spellStart"/>
+      <w:r>
+        <w:t>div</w:t>
+      </w:r>
+      <w:proofErr w:type="spellEnd"/>
+      <w:r>
+        <w:t>&gt;.</w:t>
+      </w:r>
+    </w:p>
+    <w:p>
+      <w:pPr>
+        <w:pStyle w:val="Prrafodelista"/>
+        <w:ind w:left="1440"/>
+      </w:pPr>
+    </w:p>
+    <w:p>
+      <w:pPr>
+        <w:pStyle w:val="Prrafodelista"/>
+        <w:numPr>
+          <w:ilvl w:val="0"/>
+          <w:numId w:val="1"/>
+        </w:numPr>
+      </w:pPr>
+      <w:r>
+        <w:t>17/02/2026</w:t>
+      </w:r>
+    </w:p>
+    <w:p>
+      <w:pPr>
+        <w:pStyle w:val="Prrafodelista"/>
+        <w:numPr>
+          <w:ilvl w:val="0"/>
+          <w:numId w:val="2"/>
+        </w:numPr>
+      </w:pPr>
+      <w:r>
+        <w:t xml:space="preserve">En el apartado de índice.html he realizado los recuadros </w:t>
+      </w:r>
+      <w:r>
+        <w:t>de Objetivos de Aprendizaje (creando una lista). Un recuadro de Metodología y un recuadro de instructor. He realizado unos ajustes en el CSS.</w:t>
+      </w:r>
+    </w:p>
+    <w:p>
+      <w:pPr>
+        <w:pStyle w:val="Prrafodelista"/>
+        <w:ind w:left="1440"/>
+      </w:pPr>
+    </w:p>
+    <w:p>
+      <w:pPr>
+        <w:pStyle w:val="Prrafodelista"/>
+        <w:numPr>
+          <w:ilvl w:val="0"/>
+          <w:numId w:val="1"/>
+        </w:numPr>
+      </w:pPr>
+      <w:r>
+        <w:t>18/02/2026</w:t>
+      </w:r>
+    </w:p>
+    <w:p>
+      <w:pPr>
+        <w:pStyle w:val="Prrafodelista"/>
+        <w:numPr>
+          <w:ilvl w:val="0"/>
+          <w:numId w:val="2"/>
+        </w:numPr>
+      </w:pPr>
+      <w:r>
+        <w:t xml:space="preserve">He realizado ajustes en el formulario. He centrado el </w:t>
+      </w:r>
+      <w:proofErr w:type="spellStart"/>
+      <w:r>
+        <w:t>titulo</w:t>
+      </w:r>
+      <w:proofErr w:type="spellEnd"/>
+      <w:r>
+        <w:t xml:space="preserve"> del formulario.</w:t>
+      </w:r>
+    </w:p>
+    <w:p>
+      <w:pPr>
+        <w:pStyle w:val="Prrafodelista"/>
+        <w:numPr>
+          <w:ilvl w:val="0"/>
+          <w:numId w:val="2"/>
+        </w:numPr>
+      </w:pPr>
+      <w:r>
+        <w:t xml:space="preserve">En el apartado de índice.html he incluido un </w:t>
+      </w:r>
+      <w:proofErr w:type="spellStart"/>
+      <w:r>
+        <w:t>div</w:t>
+      </w:r>
+      <w:proofErr w:type="spellEnd"/>
+      <w:r>
+        <w:t xml:space="preserve"> para poder diluir la imagen.  Además, he realizado unos retoques en el CSS.</w:t>
+      </w:r>
+    </w:p>
+    <w:p>
+      <w:pPr>
+        <w:pStyle w:val="Prrafodelista"/>
+        <w:ind w:left="1440"/>
+      </w:pPr>
+    </w:p>
+    <w:p>
+      <w:pPr>
+        <w:pStyle w:val="Prrafodelista"/>
+        <w:numPr>
+          <w:ilvl w:val="0"/>
+          <w:numId w:val="1"/>
+        </w:numPr>
+      </w:pPr>
+      <w:r>
+        <w:t>19/02/2026</w:t>
+      </w:r>
+    </w:p>
+    <w:p>
+      <w:pPr>
+        <w:pStyle w:val="Prrafodelista"/>
+        <w:numPr>
+          <w:ilvl w:val="0"/>
+          <w:numId w:val="3"/>
+        </w:numPr>
+      </w:pPr>
+      <w:r>
+        <w:t xml:space="preserve">Ampliar borde inferior del apartado de equipos de cada </w:t>
+      </w:r>
+      <w:proofErr w:type="spellStart"/>
+      <w:r>
+        <w:t>card</w:t>
+      </w:r>
+      <w:proofErr w:type="spellEnd"/>
+    </w:p>
+    <w:p>
+      <w:pPr>
+        <w:pStyle w:val="Prrafodelista"/>
+        <w:numPr>
+          <w:ilvl w:val="0"/>
+          <w:numId w:val="3"/>
+        </w:numPr>
+        <w:rPr>
+          <w:u w:val="single"/>
+        </w:rPr>
+      </w:pPr>
+      <w:proofErr w:type="spellStart"/>
+      <w:r>
+        <w:t>Prácticar</w:t>
+      </w:r>
+      <w:proofErr w:type="spellEnd"/>
+      <w:r>
+        <w:t xml:space="preserve"> Parallax</w:t>
+      </w:r>
     </w:p>
     <w:sectPr>
       <w:pgSz w:w="11906" w:h="16838"/>
@@ -39,11 +340,237 @@
 </file>
 
 <file path=word/numbering.xml><?xml version="1.0" encoding="utf-8"?>
-<w:numbering xmlns:wpc="http://schemas.microsoft.com/office/word/2010/wordprocessingCanvas" xmlns:cx="http://schemas.microsoft.com/office/drawing/2014/chartex" xmlns:cx1="http://schemas.microsoft.com/office/drawing/2015/9/8/chartex" xmlns:cx2="http://schemas.microsoft.com/office/drawing/2015/10/21/chartex" xmlns:cx3="http://schemas.microsoft.com/office/drawing/2016/5/9/chartex" xmlns:cx4="http://schemas.microsoft.com/office/drawing/2016/5/10/chartex" xmlns:cx5="http://schemas.microsoft.com/office/drawing/2016/5/11/chartex" xmlns:cx6="http://schemas.microsoft.com/office/drawing/2016/5/12/chartex" xmlns:cx7="http://schemas.microsoft.com/office/drawing/2016/5/13/chartex" xmlns:cx8="http://schemas.microsoft.com/office/drawing/2016/5/14/chartex" xmlns:mc="http://schemas.openxmlformats.org/markup-compatibility/2006" xmlns:aink="http://schemas.microsoft.com/office/drawing/2016/ink" xmlns:am3d="http://schemas.microsoft.com/office/drawing/2017/model3d" xmlns:o="urn:schemas-microsoft-com:office:office" xmlns:oel="http://schemas.microsoft.com/office/2019/extlst" xmlns:r="http://schemas.openxmlformats.org/officeDocument/2006/relationships" xmlns:m="http://schemas.openxmlformats.org/officeDocument/2006/math" xmlns:v="urn:schemas-microsoft-com:vml" xmlns:wp14="http://schemas.microsoft.com/office/word/2010/wordprocessingDrawing" xmlns:wp="http://schemas.openxmlformats.org/drawingml/2006/wordprocessingDrawing" xmlns:w10="urn:schemas-microsoft-com:office:word" xmlns:w="http://schemas.openxmlformats.org/wordprocessingml/2006/main" xmlns:w14="http://schemas.microsoft.com/office/word/2010/wordml" xmlns:w15="http://schemas.microsoft.com/office/word/2012/wordml" xmlns:w16cex="http://schemas.microsoft.com/office/word/2018/wordml/cex" xmlns:w16cid="http://schemas.microsoft.com/office/word/2016/wordml/cid" xmlns:w16="http://schemas.microsoft.com/office/word/2018/wordml" xmlns:w16du="http://schemas.microsoft.com/office/word/2023/wordml/word16du" xmlns:w16sdtdh="http://schemas.microsoft.com/office/word/2020/wordml/sdtdatahash" xmlns:w16sdtfl="http://schemas.microsoft.com/office/word/2024/wordml/sdtformatlock" xmlns:w16se="http://schemas.microsoft.com/office/word/2015/wordml/symex" xmlns:wpg="http://schemas.microsoft.com/office/word/2010/wordprocessingGroup" xmlns:wpi="http://schemas.microsoft.com/office/word/2010/wordprocessingInk" xmlns:wne="http://schemas.microsoft.com/office/word/2006/wordml" xmlns:wps="http://schemas.microsoft.com/office/word/2010/wordprocessingShape" mc:Ignorable="w14 w15 w16se w16cid w16 w16cex w16sdtdh w16sdtfl w16du wp14">
+<w:numbering xmlns:wpc="http://schemas.microsoft.com/office/word/2010/wordprocessingCanvas" xmlns:cx="http://schemas.microsoft.com/office/drawing/2014/chartex" xmlns:cx1="http://schemas.microsoft.com/office/drawing/2015/9/8/chartex" xmlns:cx2="http://schemas.microsoft.com/office/drawing/2015/10/21/chartex" xmlns:cx3="http://schemas.microsoft.com/office/drawing/2016/5/9/chartex" xmlns:cx4="http://schemas.microsoft.com/office/drawing/2016/5/10/chartex" xmlns:cx5="http://schemas.microsoft.com/office/drawing/2016/5/11/chartex" xmlns:cx6="http://schemas.microsoft.com/office/drawing/2016/5/12/chartex" xmlns:cx7="http://schemas.microsoft.com/office/drawing/2016/5/13/chartex" xmlns:cx8="http://schemas.microsoft.com/office/drawing/2016/5/14/chartex" xmlns:mc="http://schemas.openxmlformats.org/markup-compatibility/2006" xmlns:aink="http://schemas.microsoft.com/office/drawing/2016/ink" xmlns:am3d="http://schemas.microsoft.com/office/drawing/2017/model3d" xmlns:o="urn:schemas-microsoft-com:office:office" xmlns:r="http://schemas.openxmlformats.org/officeDocument/2006/relationships" xmlns:m="http://schemas.openxmlformats.org/officeDocument/2006/math" xmlns:v="urn:schemas-microsoft-com:vml" xmlns:wp14="http://schemas.microsoft.com/office/word/2010/wordprocessingDrawing" xmlns:wp="http://schemas.openxmlformats.org/drawingml/2006/wordprocessingDrawing" xmlns:w10="urn:schemas-microsoft-com:office:word" xmlns:w="http://schemas.openxmlformats.org/wordprocessingml/2006/main" xmlns:w14="http://schemas.microsoft.com/office/word/2010/wordml" xmlns:w15="http://schemas.microsoft.com/office/word/2012/wordml" xmlns:w16cex="http://schemas.microsoft.com/office/word/2018/wordml/cex" xmlns:w16cid="http://schemas.microsoft.com/office/word/2016/wordml/cid" xmlns:w16="http://schemas.microsoft.com/office/word/2018/wordml" xmlns:w16sdtdh="http://schemas.microsoft.com/office/word/2020/wordml/sdtdatahash" xmlns:w16se="http://schemas.microsoft.com/office/word/2015/wordml/symex" xmlns:wpg="http://schemas.microsoft.com/office/word/2010/wordprocessingGroup" xmlns:wpi="http://schemas.microsoft.com/office/word/2010/wordprocessingInk" xmlns:wne="http://schemas.microsoft.com/office/word/2006/wordml" xmlns:wps="http://schemas.microsoft.com/office/word/2010/wordprocessingShape" mc:Ignorable="w14 w15 w16se w16cid w16 w16cex w16sdtdh wp14">
   <w:abstractNum w:abstractNumId="0" w15:restartNumberingAfterBreak="0">
+    <w:nsid w:val="09F8288C"/>
+    <w:multiLevelType w:val="hybridMultilevel"/>
+    <w:tmpl w:val="9C20EC54"/>
+    <w:lvl w:ilvl="0" w:tplc="0C0A0003">
+      <w:start w:val="1"/>
+      <w:numFmt w:val="bullet"/>
+      <w:lvlText w:val="o"/>
+      <w:lvlJc w:val="left"/>
+      <w:pPr>
+        <w:ind w:left="1440" w:hanging="360"/>
+      </w:pPr>
+      <w:rPr>
+        <w:rFonts w:ascii="Courier New" w:hAnsi="Courier New" w:cs="Courier New" w:hint="default"/>
+      </w:rPr>
+    </w:lvl>
+    <w:lvl w:ilvl="1" w:tplc="0C0A0003" w:tentative="1">
+      <w:start w:val="1"/>
+      <w:numFmt w:val="bullet"/>
+      <w:lvlText w:val="o"/>
+      <w:lvlJc w:val="left"/>
+      <w:pPr>
+        <w:ind w:left="2160" w:hanging="360"/>
+      </w:pPr>
+      <w:rPr>
+        <w:rFonts w:ascii="Courier New" w:hAnsi="Courier New" w:cs="Courier New" w:hint="default"/>
+      </w:rPr>
+    </w:lvl>
+    <w:lvl w:ilvl="2" w:tplc="0C0A0005" w:tentative="1">
+      <w:start w:val="1"/>
+      <w:numFmt w:val="bullet"/>
+      <w:lvlText w:val=""/>
+      <w:lvlJc w:val="left"/>
+      <w:pPr>
+        <w:ind w:left="2880" w:hanging="360"/>
+      </w:pPr>
+      <w:rPr>
+        <w:rFonts w:ascii="Wingdings" w:hAnsi="Wingdings" w:hint="default"/>
+      </w:rPr>
+    </w:lvl>
+    <w:lvl w:ilvl="3" w:tplc="0C0A0001" w:tentative="1">
+      <w:start w:val="1"/>
+      <w:numFmt w:val="bullet"/>
+      <w:lvlText w:val=""/>
+      <w:lvlJc w:val="left"/>
+      <w:pPr>
+        <w:ind w:left="3600" w:hanging="360"/>
+      </w:pPr>
+      <w:rPr>
+        <w:rFonts w:ascii="Symbol" w:hAnsi="Symbol" w:hint="default"/>
+      </w:rPr>
+    </w:lvl>
+    <w:lvl w:ilvl="4" w:tplc="0C0A0003" w:tentative="1">
+      <w:start w:val="1"/>
+      <w:numFmt w:val="bullet"/>
+      <w:lvlText w:val="o"/>
+      <w:lvlJc w:val="left"/>
+      <w:pPr>
+        <w:ind w:left="4320" w:hanging="360"/>
+      </w:pPr>
+      <w:rPr>
+        <w:rFonts w:ascii="Courier New" w:hAnsi="Courier New" w:cs="Courier New" w:hint="default"/>
+      </w:rPr>
+    </w:lvl>
+    <w:lvl w:ilvl="5" w:tplc="0C0A0005" w:tentative="1">
+      <w:start w:val="1"/>
+      <w:numFmt w:val="bullet"/>
+      <w:lvlText w:val=""/>
+      <w:lvlJc w:val="left"/>
+      <w:pPr>
+        <w:ind w:left="5040" w:hanging="360"/>
+      </w:pPr>
+      <w:rPr>
+        <w:rFonts w:ascii="Wingdings" w:hAnsi="Wingdings" w:hint="default"/>
+      </w:rPr>
+    </w:lvl>
+    <w:lvl w:ilvl="6" w:tplc="0C0A0001" w:tentative="1">
+      <w:start w:val="1"/>
+      <w:numFmt w:val="bullet"/>
+      <w:lvlText w:val=""/>
+      <w:lvlJc w:val="left"/>
+      <w:pPr>
+        <w:ind w:left="5760" w:hanging="360"/>
+      </w:pPr>
+      <w:rPr>
+        <w:rFonts w:ascii="Symbol" w:hAnsi="Symbol" w:hint="default"/>
+      </w:rPr>
+    </w:lvl>
+    <w:lvl w:ilvl="7" w:tplc="0C0A0003" w:tentative="1">
+      <w:start w:val="1"/>
+      <w:numFmt w:val="bullet"/>
+      <w:lvlText w:val="o"/>
+      <w:lvlJc w:val="left"/>
+      <w:pPr>
+        <w:ind w:left="6480" w:hanging="360"/>
+      </w:pPr>
+      <w:rPr>
+        <w:rFonts w:ascii="Courier New" w:hAnsi="Courier New" w:cs="Courier New" w:hint="default"/>
+      </w:rPr>
+    </w:lvl>
+    <w:lvl w:ilvl="8" w:tplc="0C0A0005" w:tentative="1">
+      <w:start w:val="1"/>
+      <w:numFmt w:val="bullet"/>
+      <w:lvlText w:val=""/>
+      <w:lvlJc w:val="left"/>
+      <w:pPr>
+        <w:ind w:left="7200" w:hanging="360"/>
+      </w:pPr>
+      <w:rPr>
+        <w:rFonts w:ascii="Wingdings" w:hAnsi="Wingdings" w:hint="default"/>
+      </w:rPr>
+    </w:lvl>
+  </w:abstractNum>
+  <w:abstractNum w:abstractNumId="1" w15:restartNumberingAfterBreak="0">
+    <w:nsid w:val="2EE669D3"/>
+    <w:multiLevelType w:val="hybridMultilevel"/>
+    <w:tmpl w:val="314451E6"/>
+    <w:lvl w:ilvl="0" w:tplc="0C0A0003">
+      <w:start w:val="1"/>
+      <w:numFmt w:val="bullet"/>
+      <w:lvlText w:val="o"/>
+      <w:lvlJc w:val="left"/>
+      <w:pPr>
+        <w:ind w:left="1440" w:hanging="360"/>
+      </w:pPr>
+      <w:rPr>
+        <w:rFonts w:ascii="Courier New" w:hAnsi="Courier New" w:cs="Courier New" w:hint="default"/>
+      </w:rPr>
+    </w:lvl>
+    <w:lvl w:ilvl="1" w:tplc="0C0A0003" w:tentative="1">
+      <w:start w:val="1"/>
+      <w:numFmt w:val="bullet"/>
+      <w:lvlText w:val="o"/>
+      <w:lvlJc w:val="left"/>
+      <w:pPr>
+        <w:ind w:left="2160" w:hanging="360"/>
+      </w:pPr>
+      <w:rPr>
+        <w:rFonts w:ascii="Courier New" w:hAnsi="Courier New" w:cs="Courier New" w:hint="default"/>
+      </w:rPr>
+    </w:lvl>
+    <w:lvl w:ilvl="2" w:tplc="0C0A0005" w:tentative="1">
+      <w:start w:val="1"/>
+      <w:numFmt w:val="bullet"/>
+      <w:lvlText w:val=""/>
+      <w:lvlJc w:val="left"/>
+      <w:pPr>
+        <w:ind w:left="2880" w:hanging="360"/>
+      </w:pPr>
+      <w:rPr>
+        <w:rFonts w:ascii="Wingdings" w:hAnsi="Wingdings" w:hint="default"/>
+      </w:rPr>
+    </w:lvl>
+    <w:lvl w:ilvl="3" w:tplc="0C0A0001" w:tentative="1">
+      <w:start w:val="1"/>
+      <w:numFmt w:val="bullet"/>
+      <w:lvlText w:val=""/>
+      <w:lvlJc w:val="left"/>
+      <w:pPr>
+        <w:ind w:left="3600" w:hanging="360"/>
+      </w:pPr>
+      <w:rPr>
+        <w:rFonts w:ascii="Symbol" w:hAnsi="Symbol" w:hint="default"/>
+      </w:rPr>
+    </w:lvl>
+    <w:lvl w:ilvl="4" w:tplc="0C0A0003" w:tentative="1">
+      <w:start w:val="1"/>
+      <w:numFmt w:val="bullet"/>
+      <w:lvlText w:val="o"/>
+      <w:lvlJc w:val="left"/>
+      <w:pPr>
+        <w:ind w:left="4320" w:hanging="360"/>
+      </w:pPr>
+      <w:rPr>
+        <w:rFonts w:ascii="Courier New" w:hAnsi="Courier New" w:cs="Courier New" w:hint="default"/>
+      </w:rPr>
+    </w:lvl>
+    <w:lvl w:ilvl="5" w:tplc="0C0A0005" w:tentative="1">
+      <w:start w:val="1"/>
+      <w:numFmt w:val="bullet"/>
+      <w:lvlText w:val=""/>
+      <w:lvlJc w:val="left"/>
+      <w:pPr>
+        <w:ind w:left="5040" w:hanging="360"/>
+      </w:pPr>
+      <w:rPr>
+        <w:rFonts w:ascii="Wingdings" w:hAnsi="Wingdings" w:hint="default"/>
+      </w:rPr>
+    </w:lvl>
+    <w:lvl w:ilvl="6" w:tplc="0C0A0001" w:tentative="1">
+      <w:start w:val="1"/>
+      <w:numFmt w:val="bullet"/>
+      <w:lvlText w:val=""/>
+      <w:lvlJc w:val="left"/>
+      <w:pPr>
+        <w:ind w:left="5760" w:hanging="360"/>
+      </w:pPr>
+      <w:rPr>
+        <w:rFonts w:ascii="Symbol" w:hAnsi="Symbol" w:hint="default"/>
+      </w:rPr>
+    </w:lvl>
+    <w:lvl w:ilvl="7" w:tplc="0C0A0003" w:tentative="1">
+      <w:start w:val="1"/>
+      <w:numFmt w:val="bullet"/>
+      <w:lvlText w:val="o"/>
+      <w:lvlJc w:val="left"/>
+      <w:pPr>
+        <w:ind w:left="6480" w:hanging="360"/>
+      </w:pPr>
+      <w:rPr>
+        <w:rFonts w:ascii="Courier New" w:hAnsi="Courier New" w:cs="Courier New" w:hint="default"/>
+      </w:rPr>
+    </w:lvl>
+    <w:lvl w:ilvl="8" w:tplc="0C0A0005" w:tentative="1">
+      <w:start w:val="1"/>
+      <w:numFmt w:val="bullet"/>
+      <w:lvlText w:val=""/>
+      <w:lvlJc w:val="left"/>
+      <w:pPr>
+        <w:ind w:left="7200" w:hanging="360"/>
+      </w:pPr>
+      <w:rPr>
+        <w:rFonts w:ascii="Wingdings" w:hAnsi="Wingdings" w:hint="default"/>
+      </w:rPr>
+    </w:lvl>
+  </w:abstractNum>
+  <w:abstractNum w:abstractNumId="2" w15:restartNumberingAfterBreak="0">
     <w:nsid w:val="6E476C91"/>
     <w:multiLevelType w:val="hybridMultilevel"/>
-    <w:tmpl w:val="FC4A5C76"/>
+    <w:tmpl w:val="E8A6E92E"/>
     <w:lvl w:ilvl="0" w:tplc="61EE7446">
       <w:numFmt w:val="bullet"/>
       <w:lvlText w:val="-"/>
@@ -152,14 +679,20 @@
       </w:rPr>
     </w:lvl>
   </w:abstractNum>
-  <w:num w:numId="1" w16cid:durableId="1509056195">
+  <w:num w:numId="1">
+    <w:abstractNumId w:val="2"/>
+  </w:num>
+  <w:num w:numId="2">
     <w:abstractNumId w:val="0"/>
+  </w:num>
+  <w:num w:numId="3">
+    <w:abstractNumId w:val="1"/>
   </w:num>
 </w:numbering>
 </file>
 
 <file path=word/styles.xml><?xml version="1.0" encoding="utf-8"?>
-<w:styles xmlns:mc="http://schemas.openxmlformats.org/markup-compatibility/2006" xmlns:r="http://schemas.openxmlformats.org/officeDocument/2006/relationships" xmlns:w="http://schemas.openxmlformats.org/wordprocessingml/2006/main" xmlns:w14="http://schemas.microsoft.com/office/word/2010/wordml" xmlns:w15="http://schemas.microsoft.com/office/word/2012/wordml" xmlns:w16cex="http://schemas.microsoft.com/office/word/2018/wordml/cex" xmlns:w16cid="http://schemas.microsoft.com/office/word/2016/wordml/cid" xmlns:w16="http://schemas.microsoft.com/office/word/2018/wordml" xmlns:w16du="http://schemas.microsoft.com/office/word/2023/wordml/word16du" xmlns:w16sdtdh="http://schemas.microsoft.com/office/word/2020/wordml/sdtdatahash" xmlns:w16sdtfl="http://schemas.microsoft.com/office/word/2024/wordml/sdtformatlock" xmlns:w16se="http://schemas.microsoft.com/office/word/2015/wordml/symex" mc:Ignorable="w14 w15 w16se w16cid w16 w16cex w16sdtdh w16sdtfl w16du">
+<w:styles xmlns:mc="http://schemas.openxmlformats.org/markup-compatibility/2006" xmlns:r="http://schemas.openxmlformats.org/officeDocument/2006/relationships" xmlns:w="http://schemas.openxmlformats.org/wordprocessingml/2006/main" xmlns:w14="http://schemas.microsoft.com/office/word/2010/wordml" xmlns:w15="http://schemas.microsoft.com/office/word/2012/wordml" xmlns:w16cex="http://schemas.microsoft.com/office/word/2018/wordml/cex" xmlns:w16cid="http://schemas.microsoft.com/office/word/2016/wordml/cid" xmlns:w16="http://schemas.microsoft.com/office/word/2018/wordml" xmlns:w16sdtdh="http://schemas.microsoft.com/office/word/2020/wordml/sdtdatahash" xmlns:w16se="http://schemas.microsoft.com/office/word/2015/wordml/symex" mc:Ignorable="w14 w15 w16se w16cid w16 w16cex w16sdtdh">
   <w:docDefaults>
     <w:rPrDefault>
       <w:rPr>

</xml_diff>

<commit_message>
-Optimización de sheet, canvios los en apartados dde
he optimizado la sheet, colocando todo el css en una misma pagina y haciendo ajustes.
</commit_message>
<xml_diff>
--- a/Documentación del proyecto/Trazabilidad/Trazabilidad diaria - Febrero.docx
+++ b/Documentación del proyecto/Trazabilidad/Trazabilidad diaria - Febrero.docx
@@ -432,6 +432,109 @@
       <w:r>
         <w:t>Crear lista de cursos</w:t>
       </w:r>
+    </w:p>
+    <w:p>
+      <w:pPr>
+        <w:pStyle w:val="Prrafodelista"/>
+        <w:numPr>
+          <w:ilvl w:val="0"/>
+          <w:numId w:val="1"/>
+        </w:numPr>
+      </w:pPr>
+      <w:r>
+        <w:lastRenderedPageBreak/>
+        <w:t>03/03/2026</w:t>
+      </w:r>
+    </w:p>
+    <w:p>
+      <w:pPr>
+        <w:pStyle w:val="Prrafodelista"/>
+        <w:numPr>
+          <w:ilvl w:val="0"/>
+          <w:numId w:val="7"/>
+        </w:numPr>
+      </w:pPr>
+      <w:r>
+        <w:t>Remodelar apartado cursos</w:t>
+      </w:r>
+    </w:p>
+    <w:p>
+      <w:pPr>
+        <w:pStyle w:val="Prrafodelista"/>
+        <w:numPr>
+          <w:ilvl w:val="0"/>
+          <w:numId w:val="1"/>
+        </w:numPr>
+      </w:pPr>
+      <w:r>
+        <w:t>04/03/2026</w:t>
+      </w:r>
+    </w:p>
+    <w:p>
+      <w:pPr>
+        <w:pStyle w:val="Prrafodelista"/>
+        <w:numPr>
+          <w:ilvl w:val="0"/>
+          <w:numId w:val="8"/>
+        </w:numPr>
+      </w:pPr>
+      <w:r>
+        <w:t>Seguir con apartado cursos</w:t>
+      </w:r>
+    </w:p>
+    <w:p>
+      <w:pPr>
+        <w:pStyle w:val="Prrafodelista"/>
+        <w:numPr>
+          <w:ilvl w:val="0"/>
+          <w:numId w:val="1"/>
+        </w:numPr>
+      </w:pPr>
+      <w:r>
+        <w:t>05/03/2026</w:t>
+      </w:r>
+    </w:p>
+    <w:p>
+      <w:pPr>
+        <w:pStyle w:val="Prrafodelista"/>
+        <w:numPr>
+          <w:ilvl w:val="0"/>
+          <w:numId w:val="8"/>
+        </w:numPr>
+      </w:pPr>
+      <w:r>
+        <w:t>Ejercicios Python</w:t>
+      </w:r>
+    </w:p>
+    <w:p>
+      <w:pPr>
+        <w:pStyle w:val="Prrafodelista"/>
+        <w:numPr>
+          <w:ilvl w:val="0"/>
+          <w:numId w:val="1"/>
+        </w:numPr>
+      </w:pPr>
+      <w:r>
+        <w:t>06/03/2026</w:t>
+      </w:r>
+    </w:p>
+    <w:p>
+      <w:pPr>
+        <w:pStyle w:val="Prrafodelista"/>
+        <w:numPr>
+          <w:ilvl w:val="0"/>
+          <w:numId w:val="8"/>
+        </w:numPr>
+      </w:pPr>
+      <w:r>
+        <w:t>Ejercicios Python</w:t>
+      </w:r>
+    </w:p>
+    <w:p>
+      <w:pPr>
+        <w:pStyle w:val="Prrafodelista"/>
+        <w:ind w:left="1440"/>
+      </w:pPr>
     </w:p>
     <w:sectPr>
       <w:pgSz w:w="11906" w:h="16838"/>
@@ -672,6 +775,119 @@
     </w:lvl>
   </w:abstractNum>
   <w:abstractNum w:abstractNumId="2" w15:restartNumberingAfterBreak="0">
+    <w:nsid w:val="23110DB2"/>
+    <w:multiLevelType w:val="hybridMultilevel"/>
+    <w:tmpl w:val="787813B2"/>
+    <w:lvl w:ilvl="0" w:tplc="0C0A0003">
+      <w:start w:val="1"/>
+      <w:numFmt w:val="bullet"/>
+      <w:lvlText w:val="o"/>
+      <w:lvlJc w:val="left"/>
+      <w:pPr>
+        <w:ind w:left="1440" w:hanging="360"/>
+      </w:pPr>
+      <w:rPr>
+        <w:rFonts w:ascii="Courier New" w:hAnsi="Courier New" w:cs="Courier New" w:hint="default"/>
+      </w:rPr>
+    </w:lvl>
+    <w:lvl w:ilvl="1" w:tplc="0C0A0003" w:tentative="1">
+      <w:start w:val="1"/>
+      <w:numFmt w:val="bullet"/>
+      <w:lvlText w:val="o"/>
+      <w:lvlJc w:val="left"/>
+      <w:pPr>
+        <w:ind w:left="2160" w:hanging="360"/>
+      </w:pPr>
+      <w:rPr>
+        <w:rFonts w:ascii="Courier New" w:hAnsi="Courier New" w:cs="Courier New" w:hint="default"/>
+      </w:rPr>
+    </w:lvl>
+    <w:lvl w:ilvl="2" w:tplc="0C0A0005" w:tentative="1">
+      <w:start w:val="1"/>
+      <w:numFmt w:val="bullet"/>
+      <w:lvlText w:val=""/>
+      <w:lvlJc w:val="left"/>
+      <w:pPr>
+        <w:ind w:left="2880" w:hanging="360"/>
+      </w:pPr>
+      <w:rPr>
+        <w:rFonts w:ascii="Wingdings" w:hAnsi="Wingdings" w:hint="default"/>
+      </w:rPr>
+    </w:lvl>
+    <w:lvl w:ilvl="3" w:tplc="0C0A0001" w:tentative="1">
+      <w:start w:val="1"/>
+      <w:numFmt w:val="bullet"/>
+      <w:lvlText w:val=""/>
+      <w:lvlJc w:val="left"/>
+      <w:pPr>
+        <w:ind w:left="3600" w:hanging="360"/>
+      </w:pPr>
+      <w:rPr>
+        <w:rFonts w:ascii="Symbol" w:hAnsi="Symbol" w:hint="default"/>
+      </w:rPr>
+    </w:lvl>
+    <w:lvl w:ilvl="4" w:tplc="0C0A0003" w:tentative="1">
+      <w:start w:val="1"/>
+      <w:numFmt w:val="bullet"/>
+      <w:lvlText w:val="o"/>
+      <w:lvlJc w:val="left"/>
+      <w:pPr>
+        <w:ind w:left="4320" w:hanging="360"/>
+      </w:pPr>
+      <w:rPr>
+        <w:rFonts w:ascii="Courier New" w:hAnsi="Courier New" w:cs="Courier New" w:hint="default"/>
+      </w:rPr>
+    </w:lvl>
+    <w:lvl w:ilvl="5" w:tplc="0C0A0005" w:tentative="1">
+      <w:start w:val="1"/>
+      <w:numFmt w:val="bullet"/>
+      <w:lvlText w:val=""/>
+      <w:lvlJc w:val="left"/>
+      <w:pPr>
+        <w:ind w:left="5040" w:hanging="360"/>
+      </w:pPr>
+      <w:rPr>
+        <w:rFonts w:ascii="Wingdings" w:hAnsi="Wingdings" w:hint="default"/>
+      </w:rPr>
+    </w:lvl>
+    <w:lvl w:ilvl="6" w:tplc="0C0A0001" w:tentative="1">
+      <w:start w:val="1"/>
+      <w:numFmt w:val="bullet"/>
+      <w:lvlText w:val=""/>
+      <w:lvlJc w:val="left"/>
+      <w:pPr>
+        <w:ind w:left="5760" w:hanging="360"/>
+      </w:pPr>
+      <w:rPr>
+        <w:rFonts w:ascii="Symbol" w:hAnsi="Symbol" w:hint="default"/>
+      </w:rPr>
+    </w:lvl>
+    <w:lvl w:ilvl="7" w:tplc="0C0A0003" w:tentative="1">
+      <w:start w:val="1"/>
+      <w:numFmt w:val="bullet"/>
+      <w:lvlText w:val="o"/>
+      <w:lvlJc w:val="left"/>
+      <w:pPr>
+        <w:ind w:left="6480" w:hanging="360"/>
+      </w:pPr>
+      <w:rPr>
+        <w:rFonts w:ascii="Courier New" w:hAnsi="Courier New" w:cs="Courier New" w:hint="default"/>
+      </w:rPr>
+    </w:lvl>
+    <w:lvl w:ilvl="8" w:tplc="0C0A0005" w:tentative="1">
+      <w:start w:val="1"/>
+      <w:numFmt w:val="bullet"/>
+      <w:lvlText w:val=""/>
+      <w:lvlJc w:val="left"/>
+      <w:pPr>
+        <w:ind w:left="7200" w:hanging="360"/>
+      </w:pPr>
+      <w:rPr>
+        <w:rFonts w:ascii="Wingdings" w:hAnsi="Wingdings" w:hint="default"/>
+      </w:rPr>
+    </w:lvl>
+  </w:abstractNum>
+  <w:abstractNum w:abstractNumId="3" w15:restartNumberingAfterBreak="0">
     <w:nsid w:val="23BF1FF8"/>
     <w:multiLevelType w:val="hybridMultilevel"/>
     <w:tmpl w:val="3654A260"/>
@@ -784,7 +1000,7 @@
       </w:rPr>
     </w:lvl>
   </w:abstractNum>
-  <w:abstractNum w:abstractNumId="3" w15:restartNumberingAfterBreak="0">
+  <w:abstractNum w:abstractNumId="4" w15:restartNumberingAfterBreak="0">
     <w:nsid w:val="24FC1D87"/>
     <w:multiLevelType w:val="hybridMultilevel"/>
     <w:tmpl w:val="D902D056"/>
@@ -897,7 +1113,7 @@
       </w:rPr>
     </w:lvl>
   </w:abstractNum>
-  <w:abstractNum w:abstractNumId="4" w15:restartNumberingAfterBreak="0">
+  <w:abstractNum w:abstractNumId="5" w15:restartNumberingAfterBreak="0">
     <w:nsid w:val="2EE669D3"/>
     <w:multiLevelType w:val="hybridMultilevel"/>
     <w:tmpl w:val="314451E6"/>
@@ -1010,10 +1226,10 @@
       </w:rPr>
     </w:lvl>
   </w:abstractNum>
-  <w:abstractNum w:abstractNumId="5" w15:restartNumberingAfterBreak="0">
+  <w:abstractNum w:abstractNumId="6" w15:restartNumberingAfterBreak="0">
     <w:nsid w:val="6E476C91"/>
     <w:multiLevelType w:val="hybridMultilevel"/>
-    <w:tmpl w:val="A9D4D6C8"/>
+    <w:tmpl w:val="9B74305C"/>
     <w:lvl w:ilvl="0" w:tplc="61EE7446">
       <w:numFmt w:val="bullet"/>
       <w:lvlText w:val="-"/>
@@ -1116,6 +1332,119 @@
       <w:lvlJc w:val="left"/>
       <w:pPr>
         <w:ind w:left="6480" w:hanging="360"/>
+      </w:pPr>
+      <w:rPr>
+        <w:rFonts w:ascii="Wingdings" w:hAnsi="Wingdings" w:hint="default"/>
+      </w:rPr>
+    </w:lvl>
+  </w:abstractNum>
+  <w:abstractNum w:abstractNumId="7" w15:restartNumberingAfterBreak="0">
+    <w:nsid w:val="6EDB0FE0"/>
+    <w:multiLevelType w:val="hybridMultilevel"/>
+    <w:tmpl w:val="736A1704"/>
+    <w:lvl w:ilvl="0" w:tplc="0C0A0003">
+      <w:start w:val="1"/>
+      <w:numFmt w:val="bullet"/>
+      <w:lvlText w:val="o"/>
+      <w:lvlJc w:val="left"/>
+      <w:pPr>
+        <w:ind w:left="1440" w:hanging="360"/>
+      </w:pPr>
+      <w:rPr>
+        <w:rFonts w:ascii="Courier New" w:hAnsi="Courier New" w:cs="Courier New" w:hint="default"/>
+      </w:rPr>
+    </w:lvl>
+    <w:lvl w:ilvl="1" w:tplc="0C0A0003" w:tentative="1">
+      <w:start w:val="1"/>
+      <w:numFmt w:val="bullet"/>
+      <w:lvlText w:val="o"/>
+      <w:lvlJc w:val="left"/>
+      <w:pPr>
+        <w:ind w:left="2160" w:hanging="360"/>
+      </w:pPr>
+      <w:rPr>
+        <w:rFonts w:ascii="Courier New" w:hAnsi="Courier New" w:cs="Courier New" w:hint="default"/>
+      </w:rPr>
+    </w:lvl>
+    <w:lvl w:ilvl="2" w:tplc="0C0A0005" w:tentative="1">
+      <w:start w:val="1"/>
+      <w:numFmt w:val="bullet"/>
+      <w:lvlText w:val=""/>
+      <w:lvlJc w:val="left"/>
+      <w:pPr>
+        <w:ind w:left="2880" w:hanging="360"/>
+      </w:pPr>
+      <w:rPr>
+        <w:rFonts w:ascii="Wingdings" w:hAnsi="Wingdings" w:hint="default"/>
+      </w:rPr>
+    </w:lvl>
+    <w:lvl w:ilvl="3" w:tplc="0C0A0001" w:tentative="1">
+      <w:start w:val="1"/>
+      <w:numFmt w:val="bullet"/>
+      <w:lvlText w:val=""/>
+      <w:lvlJc w:val="left"/>
+      <w:pPr>
+        <w:ind w:left="3600" w:hanging="360"/>
+      </w:pPr>
+      <w:rPr>
+        <w:rFonts w:ascii="Symbol" w:hAnsi="Symbol" w:hint="default"/>
+      </w:rPr>
+    </w:lvl>
+    <w:lvl w:ilvl="4" w:tplc="0C0A0003" w:tentative="1">
+      <w:start w:val="1"/>
+      <w:numFmt w:val="bullet"/>
+      <w:lvlText w:val="o"/>
+      <w:lvlJc w:val="left"/>
+      <w:pPr>
+        <w:ind w:left="4320" w:hanging="360"/>
+      </w:pPr>
+      <w:rPr>
+        <w:rFonts w:ascii="Courier New" w:hAnsi="Courier New" w:cs="Courier New" w:hint="default"/>
+      </w:rPr>
+    </w:lvl>
+    <w:lvl w:ilvl="5" w:tplc="0C0A0005" w:tentative="1">
+      <w:start w:val="1"/>
+      <w:numFmt w:val="bullet"/>
+      <w:lvlText w:val=""/>
+      <w:lvlJc w:val="left"/>
+      <w:pPr>
+        <w:ind w:left="5040" w:hanging="360"/>
+      </w:pPr>
+      <w:rPr>
+        <w:rFonts w:ascii="Wingdings" w:hAnsi="Wingdings" w:hint="default"/>
+      </w:rPr>
+    </w:lvl>
+    <w:lvl w:ilvl="6" w:tplc="0C0A0001" w:tentative="1">
+      <w:start w:val="1"/>
+      <w:numFmt w:val="bullet"/>
+      <w:lvlText w:val=""/>
+      <w:lvlJc w:val="left"/>
+      <w:pPr>
+        <w:ind w:left="5760" w:hanging="360"/>
+      </w:pPr>
+      <w:rPr>
+        <w:rFonts w:ascii="Symbol" w:hAnsi="Symbol" w:hint="default"/>
+      </w:rPr>
+    </w:lvl>
+    <w:lvl w:ilvl="7" w:tplc="0C0A0003" w:tentative="1">
+      <w:start w:val="1"/>
+      <w:numFmt w:val="bullet"/>
+      <w:lvlText w:val="o"/>
+      <w:lvlJc w:val="left"/>
+      <w:pPr>
+        <w:ind w:left="6480" w:hanging="360"/>
+      </w:pPr>
+      <w:rPr>
+        <w:rFonts w:ascii="Courier New" w:hAnsi="Courier New" w:cs="Courier New" w:hint="default"/>
+      </w:rPr>
+    </w:lvl>
+    <w:lvl w:ilvl="8" w:tplc="0C0A0005" w:tentative="1">
+      <w:start w:val="1"/>
+      <w:numFmt w:val="bullet"/>
+      <w:lvlText w:val=""/>
+      <w:lvlJc w:val="left"/>
+      <w:pPr>
+        <w:ind w:left="7200" w:hanging="360"/>
       </w:pPr>
       <w:rPr>
         <w:rFonts w:ascii="Wingdings" w:hAnsi="Wingdings" w:hint="default"/>
@@ -1123,22 +1452,28 @@
     </w:lvl>
   </w:abstractNum>
   <w:num w:numId="1">
-    <w:abstractNumId w:val="5"/>
+    <w:abstractNumId w:val="6"/>
   </w:num>
   <w:num w:numId="2">
     <w:abstractNumId w:val="0"/>
   </w:num>
   <w:num w:numId="3">
+    <w:abstractNumId w:val="5"/>
+  </w:num>
+  <w:num w:numId="4">
     <w:abstractNumId w:val="4"/>
   </w:num>
-  <w:num w:numId="4">
+  <w:num w:numId="5">
     <w:abstractNumId w:val="3"/>
-  </w:num>
-  <w:num w:numId="5">
-    <w:abstractNumId w:val="2"/>
   </w:num>
   <w:num w:numId="6">
     <w:abstractNumId w:val="1"/>
+  </w:num>
+  <w:num w:numId="7">
+    <w:abstractNumId w:val="7"/>
+  </w:num>
+  <w:num w:numId="8">
+    <w:abstractNumId w:val="2"/>
   </w:num>
 </w:numbering>
 </file>

</xml_diff>